<commit_message>
Last Update to the project
</commit_message>
<xml_diff>
--- a/assets/ar/markers.docx
+++ b/assets/ar/markers.docx
@@ -7,7 +7,6 @@
         <w:widowControl/>
         <w:spacing w:after="160" w:line="259" w:lineRule="auto"/>
         <w:rPr>
-          <w:rFonts w:hint="cs"/>
           <w:rtl/>
         </w:rPr>
       </w:pPr>
@@ -20,6 +19,7 @@
         <w:widowControl/>
         <w:spacing w:after="160" w:line="259" w:lineRule="auto"/>
         <w:rPr>
+          <w:rFonts w:hint="cs"/>
           <w:rtl/>
         </w:rPr>
       </w:pPr>
@@ -30,18 +30,18 @@
         </w:rPr>
         <w:lastRenderedPageBreak/>
         <w:drawing>
-          <wp:anchor distT="0" distB="0" distL="114300" distR="114300" simplePos="0" relativeHeight="251657215" behindDoc="1" locked="0" layoutInCell="1" allowOverlap="1" wp14:anchorId="3E5F9789" wp14:editId="5EB55A44">
+          <wp:anchor distT="0" distB="0" distL="114300" distR="114300" simplePos="0" relativeHeight="251659264" behindDoc="1" locked="0" layoutInCell="1" allowOverlap="1" wp14:anchorId="415DBFB4" wp14:editId="6D36C56C">
             <wp:simplePos x="0" y="0"/>
-            <wp:positionH relativeFrom="margin">
-              <wp:posOffset>518615</wp:posOffset>
+            <wp:positionH relativeFrom="column">
+              <wp:posOffset>2914912</wp:posOffset>
             </wp:positionH>
             <wp:positionV relativeFrom="paragraph">
-              <wp:posOffset>3844906</wp:posOffset>
+              <wp:posOffset>-345659</wp:posOffset>
             </wp:positionV>
-            <wp:extent cx="4995081" cy="4995081"/>
+            <wp:extent cx="1828800" cy="1828800"/>
             <wp:effectExtent l="0" t="0" r="0" b="0"/>
             <wp:wrapNone/>
-            <wp:docPr id="2" name="Picture 2"/>
+            <wp:docPr id="3" name="Picture 3"/>
             <wp:cNvGraphicFramePr>
               <a:graphicFrameLocks xmlns:a="http://schemas.openxmlformats.org/drawingml/2006/main" noChangeAspect="1"/>
             </wp:cNvGraphicFramePr>
@@ -49,7 +49,7 @@
               <a:graphicData uri="http://schemas.openxmlformats.org/drawingml/2006/picture">
                 <pic:pic xmlns:pic="http://schemas.openxmlformats.org/drawingml/2006/picture">
                   <pic:nvPicPr>
-                    <pic:cNvPr id="0" name="Picture 2"/>
+                    <pic:cNvPr id="0" name="Picture 1"/>
                     <pic:cNvPicPr>
                       <a:picLocks noChangeAspect="1" noChangeArrowheads="1"/>
                     </pic:cNvPicPr>
@@ -70,7 +70,7 @@
                   <pic:spPr bwMode="auto">
                     <a:xfrm>
                       <a:off x="0" y="0"/>
-                      <a:ext cx="4996266" cy="4996266"/>
+                      <a:ext cx="1828800" cy="1828800"/>
                     </a:xfrm>
                     <a:prstGeom prst="rect">
                       <a:avLst/>
@@ -98,18 +98,18 @@
           <w:noProof/>
         </w:rPr>
         <w:drawing>
-          <wp:anchor distT="0" distB="0" distL="114300" distR="114300" simplePos="0" relativeHeight="251658240" behindDoc="1" locked="0" layoutInCell="1" allowOverlap="1" wp14:anchorId="025FADC3" wp14:editId="2CD767C9">
+          <wp:anchor distT="0" distB="0" distL="114300" distR="114300" simplePos="0" relativeHeight="251660288" behindDoc="1" locked="0" layoutInCell="1" allowOverlap="1" wp14:anchorId="69530047" wp14:editId="4F438AF5">
             <wp:simplePos x="0" y="0"/>
-            <wp:positionH relativeFrom="margin">
-              <wp:posOffset>477672</wp:posOffset>
+            <wp:positionH relativeFrom="column">
+              <wp:posOffset>4649536</wp:posOffset>
             </wp:positionH>
             <wp:positionV relativeFrom="paragraph">
-              <wp:posOffset>-1014057</wp:posOffset>
+              <wp:posOffset>-378569</wp:posOffset>
             </wp:positionV>
-            <wp:extent cx="4831307" cy="4831307"/>
-            <wp:effectExtent l="0" t="0" r="7620" b="7620"/>
+            <wp:extent cx="1828800" cy="1828800"/>
+            <wp:effectExtent l="0" t="0" r="0" b="0"/>
             <wp:wrapNone/>
-            <wp:docPr id="1" name="Picture 1"/>
+            <wp:docPr id="4" name="Picture 4"/>
             <wp:cNvGraphicFramePr>
               <a:graphicFrameLocks xmlns:a="http://schemas.openxmlformats.org/drawingml/2006/main" noChangeAspect="1"/>
             </wp:cNvGraphicFramePr>
@@ -117,7 +117,7 @@
               <a:graphicData uri="http://schemas.openxmlformats.org/drawingml/2006/picture">
                 <pic:pic xmlns:pic="http://schemas.openxmlformats.org/drawingml/2006/picture">
                   <pic:nvPicPr>
-                    <pic:cNvPr id="0" name="Picture 1"/>
+                    <pic:cNvPr id="0" name="Picture 2"/>
                     <pic:cNvPicPr>
                       <a:picLocks noChangeAspect="1" noChangeArrowheads="1"/>
                     </pic:cNvPicPr>
@@ -138,7 +138,415 @@
                   <pic:spPr bwMode="auto">
                     <a:xfrm>
                       <a:off x="0" y="0"/>
-                      <a:ext cx="4832098" cy="4832098"/>
+                      <a:ext cx="1828800" cy="1828800"/>
+                    </a:xfrm>
+                    <a:prstGeom prst="rect">
+                      <a:avLst/>
+                    </a:prstGeom>
+                    <a:noFill/>
+                    <a:ln>
+                      <a:noFill/>
+                    </a:ln>
+                  </pic:spPr>
+                </pic:pic>
+              </a:graphicData>
+            </a:graphic>
+            <wp14:sizeRelH relativeFrom="margin">
+              <wp14:pctWidth>0</wp14:pctWidth>
+            </wp14:sizeRelH>
+            <wp14:sizeRelV relativeFrom="margin">
+              <wp14:pctHeight>0</wp14:pctHeight>
+            </wp14:sizeRelV>
+          </wp:anchor>
+        </w:drawing>
+      </w:r>
+      <w:r>
+        <w:rPr>
+          <w:rFonts w:hint="cs"/>
+          <w:noProof/>
+        </w:rPr>
+        <w:drawing>
+          <wp:anchor distT="0" distB="0" distL="114300" distR="114300" simplePos="0" relativeHeight="251664384" behindDoc="1" locked="0" layoutInCell="1" allowOverlap="1" wp14:anchorId="06786C6E" wp14:editId="7AEF740A">
+            <wp:simplePos x="0" y="0"/>
+            <wp:positionH relativeFrom="page">
+              <wp:align>right</wp:align>
+            </wp:positionH>
+            <wp:positionV relativeFrom="paragraph">
+              <wp:posOffset>2173649</wp:posOffset>
+            </wp:positionV>
+            <wp:extent cx="3657600" cy="3657600"/>
+            <wp:effectExtent l="0" t="0" r="0" b="0"/>
+            <wp:wrapNone/>
+            <wp:docPr id="8" name="Picture 8"/>
+            <wp:cNvGraphicFramePr>
+              <a:graphicFrameLocks xmlns:a="http://schemas.openxmlformats.org/drawingml/2006/main" noChangeAspect="1"/>
+            </wp:cNvGraphicFramePr>
+            <a:graphic xmlns:a="http://schemas.openxmlformats.org/drawingml/2006/main">
+              <a:graphicData uri="http://schemas.openxmlformats.org/drawingml/2006/picture">
+                <pic:pic xmlns:pic="http://schemas.openxmlformats.org/drawingml/2006/picture">
+                  <pic:nvPicPr>
+                    <pic:cNvPr id="0" name="Picture 2"/>
+                    <pic:cNvPicPr>
+                      <a:picLocks noChangeAspect="1" noChangeArrowheads="1"/>
+                    </pic:cNvPicPr>
+                  </pic:nvPicPr>
+                  <pic:blipFill>
+                    <a:blip r:embed="rId6" cstate="print">
+                      <a:extLst>
+                        <a:ext uri="{28A0092B-C50C-407E-A947-70E740481C1C}">
+                          <a14:useLocalDpi xmlns:a14="http://schemas.microsoft.com/office/drawing/2010/main" val="0"/>
+                        </a:ext>
+                      </a:extLst>
+                    </a:blip>
+                    <a:srcRect/>
+                    <a:stretch>
+                      <a:fillRect/>
+                    </a:stretch>
+                  </pic:blipFill>
+                  <pic:spPr bwMode="auto">
+                    <a:xfrm>
+                      <a:off x="0" y="0"/>
+                      <a:ext cx="3657600" cy="3657600"/>
+                    </a:xfrm>
+                    <a:prstGeom prst="rect">
+                      <a:avLst/>
+                    </a:prstGeom>
+                    <a:noFill/>
+                    <a:ln>
+                      <a:noFill/>
+                    </a:ln>
+                  </pic:spPr>
+                </pic:pic>
+              </a:graphicData>
+            </a:graphic>
+            <wp14:sizeRelH relativeFrom="margin">
+              <wp14:pctWidth>0</wp14:pctWidth>
+            </wp14:sizeRelH>
+            <wp14:sizeRelV relativeFrom="margin">
+              <wp14:pctHeight>0</wp14:pctHeight>
+            </wp14:sizeRelV>
+          </wp:anchor>
+        </w:drawing>
+      </w:r>
+      <w:r>
+        <w:rPr>
+          <w:rFonts w:hint="cs"/>
+          <w:noProof/>
+        </w:rPr>
+        <w:drawing>
+          <wp:anchor distT="0" distB="0" distL="114300" distR="114300" simplePos="0" relativeHeight="251666432" behindDoc="1" locked="0" layoutInCell="1" allowOverlap="1" wp14:anchorId="7959958A" wp14:editId="25279798">
+            <wp:simplePos x="0" y="0"/>
+            <wp:positionH relativeFrom="page">
+              <wp:align>right</wp:align>
+            </wp:positionH>
+            <wp:positionV relativeFrom="paragraph">
+              <wp:posOffset>5534485</wp:posOffset>
+            </wp:positionV>
+            <wp:extent cx="3657600" cy="3657600"/>
+            <wp:effectExtent l="0" t="0" r="0" b="0"/>
+            <wp:wrapNone/>
+            <wp:docPr id="9" name="Picture 9"/>
+            <wp:cNvGraphicFramePr>
+              <a:graphicFrameLocks xmlns:a="http://schemas.openxmlformats.org/drawingml/2006/main" noChangeAspect="1"/>
+            </wp:cNvGraphicFramePr>
+            <a:graphic xmlns:a="http://schemas.openxmlformats.org/drawingml/2006/main">
+              <a:graphicData uri="http://schemas.openxmlformats.org/drawingml/2006/picture">
+                <pic:pic xmlns:pic="http://schemas.openxmlformats.org/drawingml/2006/picture">
+                  <pic:nvPicPr>
+                    <pic:cNvPr id="0" name="Picture 1"/>
+                    <pic:cNvPicPr>
+                      <a:picLocks noChangeAspect="1" noChangeArrowheads="1"/>
+                    </pic:cNvPicPr>
+                  </pic:nvPicPr>
+                  <pic:blipFill>
+                    <a:blip r:embed="rId7" cstate="print">
+                      <a:extLst>
+                        <a:ext uri="{28A0092B-C50C-407E-A947-70E740481C1C}">
+                          <a14:useLocalDpi xmlns:a14="http://schemas.microsoft.com/office/drawing/2010/main" val="0"/>
+                        </a:ext>
+                      </a:extLst>
+                    </a:blip>
+                    <a:srcRect/>
+                    <a:stretch>
+                      <a:fillRect/>
+                    </a:stretch>
+                  </pic:blipFill>
+                  <pic:spPr bwMode="auto">
+                    <a:xfrm>
+                      <a:off x="0" y="0"/>
+                      <a:ext cx="3657600" cy="3657600"/>
+                    </a:xfrm>
+                    <a:prstGeom prst="rect">
+                      <a:avLst/>
+                    </a:prstGeom>
+                    <a:noFill/>
+                    <a:ln>
+                      <a:noFill/>
+                    </a:ln>
+                  </pic:spPr>
+                </pic:pic>
+              </a:graphicData>
+            </a:graphic>
+            <wp14:sizeRelH relativeFrom="margin">
+              <wp14:pctWidth>0</wp14:pctWidth>
+            </wp14:sizeRelH>
+            <wp14:sizeRelV relativeFrom="margin">
+              <wp14:pctHeight>0</wp14:pctHeight>
+            </wp14:sizeRelV>
+          </wp:anchor>
+        </w:drawing>
+      </w:r>
+      <w:r>
+        <w:rPr>
+          <w:rFonts w:hint="cs"/>
+          <w:noProof/>
+        </w:rPr>
+        <w:drawing>
+          <wp:anchor distT="0" distB="0" distL="114300" distR="114300" simplePos="0" relativeHeight="251668480" behindDoc="1" locked="0" layoutInCell="1" allowOverlap="1" wp14:anchorId="3484D044" wp14:editId="615C1893">
+            <wp:simplePos x="0" y="0"/>
+            <wp:positionH relativeFrom="column">
+              <wp:posOffset>-805815</wp:posOffset>
+            </wp:positionH>
+            <wp:positionV relativeFrom="paragraph">
+              <wp:posOffset>5533171</wp:posOffset>
+            </wp:positionV>
+            <wp:extent cx="3657600" cy="3657600"/>
+            <wp:effectExtent l="0" t="0" r="0" b="0"/>
+            <wp:wrapNone/>
+            <wp:docPr id="10" name="Picture 10"/>
+            <wp:cNvGraphicFramePr>
+              <a:graphicFrameLocks xmlns:a="http://schemas.openxmlformats.org/drawingml/2006/main" noChangeAspect="1"/>
+            </wp:cNvGraphicFramePr>
+            <a:graphic xmlns:a="http://schemas.openxmlformats.org/drawingml/2006/main">
+              <a:graphicData uri="http://schemas.openxmlformats.org/drawingml/2006/picture">
+                <pic:pic xmlns:pic="http://schemas.openxmlformats.org/drawingml/2006/picture">
+                  <pic:nvPicPr>
+                    <pic:cNvPr id="0" name="Picture 2"/>
+                    <pic:cNvPicPr>
+                      <a:picLocks noChangeAspect="1" noChangeArrowheads="1"/>
+                    </pic:cNvPicPr>
+                  </pic:nvPicPr>
+                  <pic:blipFill>
+                    <a:blip r:embed="rId8" cstate="print">
+                      <a:extLst>
+                        <a:ext uri="{28A0092B-C50C-407E-A947-70E740481C1C}">
+                          <a14:useLocalDpi xmlns:a14="http://schemas.microsoft.com/office/drawing/2010/main" val="0"/>
+                        </a:ext>
+                      </a:extLst>
+                    </a:blip>
+                    <a:srcRect/>
+                    <a:stretch>
+                      <a:fillRect/>
+                    </a:stretch>
+                  </pic:blipFill>
+                  <pic:spPr bwMode="auto">
+                    <a:xfrm>
+                      <a:off x="0" y="0"/>
+                      <a:ext cx="3657600" cy="3657600"/>
+                    </a:xfrm>
+                    <a:prstGeom prst="rect">
+                      <a:avLst/>
+                    </a:prstGeom>
+                    <a:noFill/>
+                    <a:ln>
+                      <a:noFill/>
+                    </a:ln>
+                  </pic:spPr>
+                </pic:pic>
+              </a:graphicData>
+            </a:graphic>
+            <wp14:sizeRelH relativeFrom="margin">
+              <wp14:pctWidth>0</wp14:pctWidth>
+            </wp14:sizeRelH>
+            <wp14:sizeRelV relativeFrom="margin">
+              <wp14:pctHeight>0</wp14:pctHeight>
+            </wp14:sizeRelV>
+          </wp:anchor>
+        </w:drawing>
+      </w:r>
+      <w:r>
+        <w:rPr>
+          <w:rFonts w:hint="cs"/>
+          <w:noProof/>
+        </w:rPr>
+        <w:drawing>
+          <wp:anchor distT="0" distB="0" distL="114300" distR="114300" simplePos="0" relativeHeight="251662336" behindDoc="1" locked="0" layoutInCell="1" allowOverlap="1" wp14:anchorId="58072FED" wp14:editId="3D7C3723">
+            <wp:simplePos x="0" y="0"/>
+            <wp:positionH relativeFrom="margin">
+              <wp:posOffset>-808706</wp:posOffset>
+            </wp:positionH>
+            <wp:positionV relativeFrom="paragraph">
+              <wp:posOffset>1870710</wp:posOffset>
+            </wp:positionV>
+            <wp:extent cx="3657600" cy="3657600"/>
+            <wp:effectExtent l="0" t="0" r="0" b="0"/>
+            <wp:wrapNone/>
+            <wp:docPr id="5" name="Picture 5"/>
+            <wp:cNvGraphicFramePr>
+              <a:graphicFrameLocks xmlns:a="http://schemas.openxmlformats.org/drawingml/2006/main" noChangeAspect="1"/>
+            </wp:cNvGraphicFramePr>
+            <a:graphic xmlns:a="http://schemas.openxmlformats.org/drawingml/2006/main">
+              <a:graphicData uri="http://schemas.openxmlformats.org/drawingml/2006/picture">
+                <pic:pic xmlns:pic="http://schemas.openxmlformats.org/drawingml/2006/picture">
+                  <pic:nvPicPr>
+                    <pic:cNvPr id="0" name="Picture 1"/>
+                    <pic:cNvPicPr>
+                      <a:picLocks noChangeAspect="1" noChangeArrowheads="1"/>
+                    </pic:cNvPicPr>
+                  </pic:nvPicPr>
+                  <pic:blipFill>
+                    <a:blip r:embed="rId9" cstate="print">
+                      <a:extLst>
+                        <a:ext uri="{28A0092B-C50C-407E-A947-70E740481C1C}">
+                          <a14:useLocalDpi xmlns:a14="http://schemas.microsoft.com/office/drawing/2010/main" val="0"/>
+                        </a:ext>
+                      </a:extLst>
+                    </a:blip>
+                    <a:srcRect/>
+                    <a:stretch>
+                      <a:fillRect/>
+                    </a:stretch>
+                  </pic:blipFill>
+                  <pic:spPr bwMode="auto">
+                    <a:xfrm>
+                      <a:off x="0" y="0"/>
+                      <a:ext cx="3657600" cy="3657600"/>
+                    </a:xfrm>
+                    <a:prstGeom prst="rect">
+                      <a:avLst/>
+                    </a:prstGeom>
+                    <a:noFill/>
+                    <a:ln>
+                      <a:noFill/>
+                    </a:ln>
+                  </pic:spPr>
+                </pic:pic>
+              </a:graphicData>
+            </a:graphic>
+            <wp14:sizeRelH relativeFrom="margin">
+              <wp14:pctWidth>0</wp14:pctWidth>
+            </wp14:sizeRelH>
+            <wp14:sizeRelV relativeFrom="margin">
+              <wp14:pctHeight>0</wp14:pctHeight>
+            </wp14:sizeRelV>
+          </wp:anchor>
+        </w:drawing>
+      </w:r>
+      <w:r>
+        <w:rPr>
+          <w:rFonts w:hint="cs"/>
+          <w:noProof/>
+        </w:rPr>
+        <w:drawing>
+          <wp:anchor distT="0" distB="0" distL="114300" distR="114300" simplePos="0" relativeHeight="251657215" behindDoc="1" locked="0" layoutInCell="1" allowOverlap="1" wp14:anchorId="3E5F9789" wp14:editId="68C08A08">
+            <wp:simplePos x="0" y="0"/>
+            <wp:positionH relativeFrom="margin">
+              <wp:posOffset>942646</wp:posOffset>
+            </wp:positionH>
+            <wp:positionV relativeFrom="paragraph">
+              <wp:posOffset>-474674</wp:posOffset>
+            </wp:positionV>
+            <wp:extent cx="1828800" cy="1828800"/>
+            <wp:effectExtent l="0" t="0" r="0" b="0"/>
+            <wp:wrapNone/>
+            <wp:docPr id="2" name="Picture 2"/>
+            <wp:cNvGraphicFramePr>
+              <a:graphicFrameLocks xmlns:a="http://schemas.openxmlformats.org/drawingml/2006/main" noChangeAspect="1"/>
+            </wp:cNvGraphicFramePr>
+            <a:graphic xmlns:a="http://schemas.openxmlformats.org/drawingml/2006/main">
+              <a:graphicData uri="http://schemas.openxmlformats.org/drawingml/2006/picture">
+                <pic:pic xmlns:pic="http://schemas.openxmlformats.org/drawingml/2006/picture">
+                  <pic:nvPicPr>
+                    <pic:cNvPr id="0" name="Picture 2"/>
+                    <pic:cNvPicPr>
+                      <a:picLocks noChangeAspect="1" noChangeArrowheads="1"/>
+                    </pic:cNvPicPr>
+                  </pic:nvPicPr>
+                  <pic:blipFill>
+                    <a:blip r:embed="rId10" cstate="print">
+                      <a:extLst>
+                        <a:ext uri="{28A0092B-C50C-407E-A947-70E740481C1C}">
+                          <a14:useLocalDpi xmlns:a14="http://schemas.microsoft.com/office/drawing/2010/main" val="0"/>
+                        </a:ext>
+                      </a:extLst>
+                    </a:blip>
+                    <a:srcRect/>
+                    <a:stretch>
+                      <a:fillRect/>
+                    </a:stretch>
+                  </pic:blipFill>
+                  <pic:spPr bwMode="auto">
+                    <a:xfrm>
+                      <a:off x="0" y="0"/>
+                      <a:ext cx="1828800" cy="1828800"/>
+                    </a:xfrm>
+                    <a:prstGeom prst="rect">
+                      <a:avLst/>
+                    </a:prstGeom>
+                    <a:noFill/>
+                    <a:ln>
+                      <a:noFill/>
+                    </a:ln>
+                  </pic:spPr>
+                </pic:pic>
+              </a:graphicData>
+            </a:graphic>
+            <wp14:sizeRelH relativeFrom="margin">
+              <wp14:pctWidth>0</wp14:pctWidth>
+            </wp14:sizeRelH>
+            <wp14:sizeRelV relativeFrom="margin">
+              <wp14:pctHeight>0</wp14:pctHeight>
+            </wp14:sizeRelV>
+          </wp:anchor>
+        </w:drawing>
+      </w:r>
+      <w:r>
+        <w:rPr>
+          <w:rFonts w:hint="cs"/>
+          <w:noProof/>
+        </w:rPr>
+        <w:drawing>
+          <wp:anchor distT="0" distB="0" distL="114300" distR="114300" simplePos="0" relativeHeight="251658240" behindDoc="1" locked="0" layoutInCell="1" allowOverlap="1" wp14:anchorId="025FADC3" wp14:editId="1557EA34">
+            <wp:simplePos x="0" y="0"/>
+            <wp:positionH relativeFrom="margin">
+              <wp:posOffset>-835332</wp:posOffset>
+            </wp:positionH>
+            <wp:positionV relativeFrom="paragraph">
+              <wp:posOffset>-456061</wp:posOffset>
+            </wp:positionV>
+            <wp:extent cx="1828800" cy="1828800"/>
+            <wp:effectExtent l="0" t="0" r="0" b="0"/>
+            <wp:wrapNone/>
+            <wp:docPr id="1" name="Picture 1"/>
+            <wp:cNvGraphicFramePr>
+              <a:graphicFrameLocks xmlns:a="http://schemas.openxmlformats.org/drawingml/2006/main" noChangeAspect="1"/>
+            </wp:cNvGraphicFramePr>
+            <a:graphic xmlns:a="http://schemas.openxmlformats.org/drawingml/2006/main">
+              <a:graphicData uri="http://schemas.openxmlformats.org/drawingml/2006/picture">
+                <pic:pic xmlns:pic="http://schemas.openxmlformats.org/drawingml/2006/picture">
+                  <pic:nvPicPr>
+                    <pic:cNvPr id="0" name="Picture 1"/>
+                    <pic:cNvPicPr>
+                      <a:picLocks noChangeAspect="1" noChangeArrowheads="1"/>
+                    </pic:cNvPicPr>
+                  </pic:nvPicPr>
+                  <pic:blipFill>
+                    <a:blip r:embed="rId11" cstate="print">
+                      <a:extLst>
+                        <a:ext uri="{28A0092B-C50C-407E-A947-70E740481C1C}">
+                          <a14:useLocalDpi xmlns:a14="http://schemas.microsoft.com/office/drawing/2010/main" val="0"/>
+                        </a:ext>
+                      </a:extLst>
+                    </a:blip>
+                    <a:srcRect/>
+                    <a:stretch>
+                      <a:fillRect/>
+                    </a:stretch>
+                  </pic:blipFill>
+                  <pic:spPr bwMode="auto">
+                    <a:xfrm>
+                      <a:off x="0" y="0"/>
+                      <a:ext cx="1828800" cy="1828800"/>
                     </a:xfrm>
                     <a:prstGeom prst="rect">
                       <a:avLst/>
@@ -170,7 +578,6 @@
     <w:p>
       <w:pPr>
         <w:rPr>
-          <w:rFonts w:hint="cs"/>
           <w:rtl/>
         </w:rPr>
       </w:pPr>

</xml_diff>